<commit_message>
fix(sds): uszczelnienie ekstrakcji CAS (eliminacja falszywego 002-00-6 z INDEX), wdrozenie Bacdanolu i walidacja karty SANDALO (ADR-083)
</commit_message>
<xml_diff>
--- a/docs/SDS/Karta_Charakterystyki_8034055535431_SDS_TALCO.docx
+++ b/docs/SDS/Karta_Charakterystyki_8034055535431_SDS_TALCO.docx
@@ -272,6 +272,19 @@
     </w:p>
     <w:p>
       <w:pPr>
+        <w:spacing w:after="80"/>
+      </w:pPr>
+      <w:r>
+        <w:rPr>
+          <w:rFonts w:ascii="Arial" w:cs="Arial" w:eastAsia="Arial" w:hAnsi="Arial"/>
+          <w:sz w:val="20"/>
+          <w:szCs w:val="20"/>
+        </w:rPr>
+        <w:t xml:space="preserve">SEKCJA 1: Identyfikacja substancji/mieszaniny i identyfikacja przedsiębiorstwa</w:t>
+      </w:r>
+    </w:p>
+    <w:p>
+      <w:pPr>
         <w:spacing w:after="100" w:before="200"/>
       </w:pPr>
       <w:r>
@@ -282,20 +295,114 @@
           <w:sz w:val="20"/>
           <w:szCs w:val="20"/>
         </w:rPr>
+        <w:t xml:space="preserve">1.1. Identyfikator produktu</w:t>
+      </w:r>
+    </w:p>
+    <w:p>
+      <w:pPr>
+        <w:spacing w:after="80" w:before="80"/>
+      </w:pPr>
+      <w:r>
+        <w:rPr>
+          <w:rFonts w:ascii="Arial" w:cs="Arial" w:eastAsia="Arial" w:hAnsi="Arial"/>
+          <w:b/>
+          <w:bCs/>
+          <w:sz w:val="20"/>
+          <w:szCs w:val="20"/>
+        </w:rPr>
+        <w:t xml:space="preserve">Nazwa handlowa:</w:t>
+      </w:r>
+      <w:r>
+        <w:rPr>
+          <w:rFonts w:ascii="Arial" w:cs="Arial" w:eastAsia="Arial" w:hAnsi="Arial"/>
+          <w:sz w:val="20"/>
+          <w:szCs w:val="20"/>
+        </w:rPr>
+        <w:t xml:space="preserve"> SWEET HOME - PROFUMATORE AMBIENTE TALCO</w:t>
+      </w:r>
+    </w:p>
+    <w:p>
+      <w:pPr>
+        <w:spacing w:after="80" w:before="80"/>
+      </w:pPr>
+      <w:r>
+        <w:rPr>
+          <w:rFonts w:ascii="Arial" w:cs="Arial" w:eastAsia="Arial" w:hAnsi="Arial"/>
+          <w:b/>
+          <w:bCs/>
+          <w:sz w:val="20"/>
+          <w:szCs w:val="20"/>
+        </w:rPr>
+        <w:t xml:space="preserve">Kod produktu:</w:t>
+      </w:r>
+      <w:r>
+        <w:rPr>
+          <w:rFonts w:ascii="Arial" w:cs="Arial" w:eastAsia="Arial" w:hAnsi="Arial"/>
+          <w:sz w:val="20"/>
+          <w:szCs w:val="20"/>
+        </w:rPr>
+        <w:t xml:space="preserve"> BLK0039-2</w:t>
+      </w:r>
+    </w:p>
+    <w:p>
+      <w:pPr>
+        <w:spacing w:after="80" w:before="80"/>
+      </w:pPr>
+      <w:r>
+        <w:rPr>
+          <w:rFonts w:ascii="Arial" w:cs="Arial" w:eastAsia="Arial" w:hAnsi="Arial"/>
+          <w:b/>
+          <w:bCs/>
+          <w:sz w:val="20"/>
+          <w:szCs w:val="20"/>
+        </w:rPr>
+        <w:t xml:space="preserve">UFI:</w:t>
+      </w:r>
+      <w:r>
+        <w:rPr>
+          <w:rFonts w:ascii="Arial" w:cs="Arial" w:eastAsia="Arial" w:hAnsi="Arial"/>
+          <w:sz w:val="20"/>
+          <w:szCs w:val="20"/>
+        </w:rPr>
+        <w:t xml:space="preserve"> 6Q0C-W3XS-XX0U-F315</w:t>
+      </w:r>
+    </w:p>
+    <w:p>
+      <w:pPr>
+        <w:spacing w:after="100" w:before="200"/>
+      </w:pPr>
+      <w:r>
+        <w:rPr>
+          <w:rFonts w:ascii="Arial" w:cs="Arial" w:eastAsia="Arial" w:hAnsi="Arial"/>
+          <w:b/>
+          <w:bCs/>
+          <w:sz w:val="20"/>
+          <w:szCs w:val="20"/>
+        </w:rPr>
         <w:t xml:space="preserve">1.2. Istotne zidentyfikowane zastosowania substancji lub mieszaniny oraz zastosowania odradzane</w:t>
       </w:r>
     </w:p>
     <w:p>
       <w:pPr>
-        <w:spacing w:after="80"/>
-      </w:pPr>
-      <w:r>
-        <w:rPr>
-          <w:rFonts w:ascii="Arial" w:cs="Arial" w:eastAsia="Arial" w:hAnsi="Arial"/>
-          <w:sz w:val="20"/>
-          <w:szCs w:val="20"/>
-        </w:rPr>
-        <w:t xml:space="preserve">Zastosowanie: Odświeżacz powietrza (dyfuzor zapachowy).</w:t>
+        <w:spacing w:after="80" w:before="80"/>
+      </w:pPr>
+      <w:r>
+        <w:rPr>
+          <w:rFonts w:ascii="Arial" w:cs="Arial" w:eastAsia="Arial" w:hAnsi="Arial"/>
+          <w:b/>
+          <w:bCs/>
+          <w:sz w:val="20"/>
+          <w:szCs w:val="20"/>
+        </w:rPr>
+        <w:t xml:space="preserve">Zastosowanie zidentyfikowane:</w:t>
+      </w:r>
+      <w:r>
+        <w:rPr>
+          <w:rFonts w:ascii="Arial" w:cs="Arial" w:eastAsia="Arial" w:hAnsi="Arial"/>
+          <w:sz w:val="20"/>
+          <w:szCs w:val="20"/>
+        </w:rPr>
+        <w:t xml:space="preserve"> Zastosowanie konsumenckie: Room deodorant.</w:t>
       </w:r>
     </w:p>
     <w:p>
@@ -318,7 +425,236 @@
           <w:sz w:val="20"/>
           <w:szCs w:val="20"/>
         </w:rPr>
-        <w:t xml:space="preserve"> Brak.</w:t>
+        <w:t xml:space="preserve"> Wszelkie inne zastosowania nieprzewidziane przez producenta (nie stosować do celów przemysłowych ani profesjonalnych).</w:t>
+      </w:r>
+    </w:p>
+    <w:p>
+      <w:pPr>
+        <w:spacing w:after="100" w:before="200"/>
+      </w:pPr>
+      <w:r>
+        <w:rPr>
+          <w:rFonts w:ascii="Arial" w:cs="Arial" w:eastAsia="Arial" w:hAnsi="Arial"/>
+          <w:b/>
+          <w:bCs/>
+          <w:sz w:val="20"/>
+          <w:szCs w:val="20"/>
+        </w:rPr>
+        <w:t xml:space="preserve">1.3. Dane dotyczące dostawcy karty charakterystyki</w:t>
+      </w:r>
+    </w:p>
+    <w:p>
+      <w:pPr>
+        <w:spacing w:after="80" w:before="80"/>
+      </w:pPr>
+      <w:r>
+        <w:rPr>
+          <w:rFonts w:ascii="Arial" w:cs="Arial" w:eastAsia="Arial" w:hAnsi="Arial"/>
+          <w:b/>
+          <w:bCs/>
+          <w:sz w:val="20"/>
+          <w:szCs w:val="20"/>
+        </w:rPr>
+        <w:t xml:space="preserve">Firma:</w:t>
+      </w:r>
+      <w:r>
+        <w:rPr>
+          <w:rFonts w:ascii="Arial" w:cs="Arial" w:eastAsia="Arial" w:hAnsi="Arial"/>
+          <w:sz w:val="20"/>
+          <w:szCs w:val="20"/>
+        </w:rPr>
+        <w:t xml:space="preserve"> ITALLUX Sp. z o.o.</w:t>
+      </w:r>
+    </w:p>
+    <w:p>
+      <w:pPr>
+        <w:spacing w:after="80" w:before="80"/>
+      </w:pPr>
+      <w:r>
+        <w:rPr>
+          <w:rFonts w:ascii="Arial" w:cs="Arial" w:eastAsia="Arial" w:hAnsi="Arial"/>
+          <w:b/>
+          <w:bCs/>
+          <w:sz w:val="20"/>
+          <w:szCs w:val="20"/>
+        </w:rPr>
+        <w:t xml:space="preserve">Adres:</w:t>
+      </w:r>
+      <w:r>
+        <w:rPr>
+          <w:rFonts w:ascii="Arial" w:cs="Arial" w:eastAsia="Arial" w:hAnsi="Arial"/>
+          <w:sz w:val="20"/>
+          <w:szCs w:val="20"/>
+        </w:rPr>
+        <w:t xml:space="preserve"> ul. Wesoła 16, 63-600 Kępno</w:t>
+      </w:r>
+    </w:p>
+    <w:p>
+      <w:pPr>
+        <w:spacing w:after="80" w:before="80"/>
+      </w:pPr>
+      <w:r>
+        <w:rPr>
+          <w:rFonts w:ascii="Arial" w:cs="Arial" w:eastAsia="Arial" w:hAnsi="Arial"/>
+          <w:b/>
+          <w:bCs/>
+          <w:sz w:val="20"/>
+          <w:szCs w:val="20"/>
+        </w:rPr>
+        <w:t xml:space="preserve">E-mail:</w:t>
+      </w:r>
+      <w:r>
+        <w:rPr>
+          <w:rFonts w:ascii="Arial" w:cs="Arial" w:eastAsia="Arial" w:hAnsi="Arial"/>
+          <w:sz w:val="20"/>
+          <w:szCs w:val="20"/>
+        </w:rPr>
+        <w:t xml:space="preserve"> kontakt@prostozwloch.com.pl</w:t>
+      </w:r>
+    </w:p>
+    <w:p>
+      <w:pPr>
+        <w:spacing w:after="80" w:before="80"/>
+      </w:pPr>
+      <w:r>
+        <w:rPr>
+          <w:rFonts w:ascii="Arial" w:cs="Arial" w:eastAsia="Arial" w:hAnsi="Arial"/>
+          <w:b/>
+          <w:bCs/>
+          <w:sz w:val="20"/>
+          <w:szCs w:val="20"/>
+        </w:rPr>
+        <w:t xml:space="preserve">Telefon:</w:t>
+      </w:r>
+      <w:r>
+        <w:rPr>
+          <w:rFonts w:ascii="Arial" w:cs="Arial" w:eastAsia="Arial" w:hAnsi="Arial"/>
+          <w:sz w:val="20"/>
+          <w:szCs w:val="20"/>
+        </w:rPr>
+        <w:t xml:space="preserve"> +48 663116607</w:t>
+      </w:r>
+    </w:p>
+    <w:p>
+      <w:pPr>
+        <w:spacing w:after="100" w:before="200"/>
+      </w:pPr>
+      <w:r>
+        <w:rPr>
+          <w:rFonts w:ascii="Arial" w:cs="Arial" w:eastAsia="Arial" w:hAnsi="Arial"/>
+          <w:b/>
+          <w:bCs/>
+          <w:sz w:val="20"/>
+          <w:szCs w:val="20"/>
+        </w:rPr>
+        <w:t xml:space="preserve">1.4. Numer telefonu alarmowego</w:t>
+      </w:r>
+    </w:p>
+    <w:p>
+      <w:pPr>
+        <w:spacing w:after="80" w:before="80"/>
+      </w:pPr>
+      <w:r>
+        <w:rPr>
+          <w:rFonts w:ascii="Arial" w:cs="Arial" w:eastAsia="Arial" w:hAnsi="Arial"/>
+          <w:b/>
+          <w:bCs/>
+          <w:sz w:val="20"/>
+          <w:szCs w:val="20"/>
+        </w:rPr>
+        <w:t xml:space="preserve">Telefon alarmowy przedsiębiorstwa:</w:t>
+      </w:r>
+      <w:r>
+        <w:rPr>
+          <w:rFonts w:ascii="Arial" w:cs="Arial" w:eastAsia="Arial" w:hAnsi="Arial"/>
+          <w:sz w:val="20"/>
+          <w:szCs w:val="20"/>
+        </w:rPr>
+        <w:t xml:space="preserve"> +48 663116607 (czynny od poniedziałku do piątku w godzinach 8:00 – 16:00, informacja udzielana w języku polskim)</w:t>
+      </w:r>
+    </w:p>
+    <w:p>
+      <w:pPr>
+        <w:spacing w:after="80" w:before="150"/>
+      </w:pPr>
+      <w:r>
+        <w:rPr>
+          <w:rFonts w:ascii="Arial" w:cs="Arial" w:eastAsia="Arial" w:hAnsi="Arial"/>
+          <w:b/>
+          <w:bCs/>
+          <w:sz w:val="20"/>
+          <w:szCs w:val="20"/>
+        </w:rPr>
+        <w:t xml:space="preserve">Informacja toksykologiczna w Polsce (organ doradczy):</w:t>
+      </w:r>
+    </w:p>
+    <w:p>
+      <w:pPr>
+        <w:spacing w:after="80" w:before="80"/>
+      </w:pPr>
+      <w:r>
+        <w:rPr>
+          <w:rFonts w:ascii="Arial" w:cs="Arial" w:eastAsia="Arial" w:hAnsi="Arial"/>
+          <w:b/>
+          <w:bCs/>
+          <w:sz w:val="20"/>
+          <w:szCs w:val="20"/>
+        </w:rPr>
+        <w:t xml:space="preserve">Krajowe Centrum Informacji Toksykologicznej (Instytut Medycyny Pracy im. prof. J. Nofera w Łodzi):</w:t>
+      </w:r>
+      <w:r>
+        <w:rPr>
+          <w:rFonts w:ascii="Arial" w:cs="Arial" w:eastAsia="Arial" w:hAnsi="Arial"/>
+          <w:sz w:val="20"/>
+          <w:szCs w:val="20"/>
+        </w:rPr>
+        <w:t xml:space="preserve"> tel. +48 42 631 47 24, +48 42 631 47 25 (czynne w dni robocze w godz. 7:00 – 15:00)</w:t>
+      </w:r>
+    </w:p>
+    <w:p>
+      <w:pPr>
+        <w:spacing w:after="80" w:before="80"/>
+      </w:pPr>
+      <w:r>
+        <w:rPr>
+          <w:rFonts w:ascii="Arial" w:cs="Arial" w:eastAsia="Arial" w:hAnsi="Arial"/>
+          <w:b/>
+          <w:bCs/>
+          <w:sz w:val="20"/>
+          <w:szCs w:val="20"/>
+        </w:rPr>
+        <w:t xml:space="preserve">Ośrodek Informacji Toksykologicznej w Warszawie (całodobowa informacja toksykologiczna 24/7):</w:t>
+      </w:r>
+      <w:r>
+        <w:rPr>
+          <w:rFonts w:ascii="Arial" w:cs="Arial" w:eastAsia="Arial" w:hAnsi="Arial"/>
+          <w:sz w:val="20"/>
+          <w:szCs w:val="20"/>
+        </w:rPr>
+        <w:t xml:space="preserve"> tel. +48 22 619 66 54</w:t>
+      </w:r>
+    </w:p>
+    <w:p>
+      <w:pPr>
+        <w:spacing w:after="80" w:before="80"/>
+      </w:pPr>
+      <w:r>
+        <w:rPr>
+          <w:rFonts w:ascii="Arial" w:cs="Arial" w:eastAsia="Arial" w:hAnsi="Arial"/>
+          <w:b/>
+          <w:bCs/>
+          <w:sz w:val="20"/>
+          <w:szCs w:val="20"/>
+        </w:rPr>
+        <w:t xml:space="preserve">Ogólne telefony ratunkowe w nagłych wypadkach:</w:t>
+      </w:r>
+      <w:r>
+        <w:rPr>
+          <w:rFonts w:ascii="Arial" w:cs="Arial" w:eastAsia="Arial" w:hAnsi="Arial"/>
+          <w:sz w:val="20"/>
+          <w:szCs w:val="20"/>
+        </w:rPr>
+        <w:t xml:space="preserve"> 112 (ogólnoeuropejski numer alarmowy), 998 (straż pożarna), 999 (pogotowie ratunkowe)</w:t>
       </w:r>
     </w:p>
     <w:p>
@@ -710,7 +1046,7 @@
           <w:sz w:val="20"/>
           <w:szCs w:val="20"/>
         </w:rPr>
-        <w:t xml:space="preserve">Piktogramy określające rodzaj zagrożenia:</w:t>
+        <w:t xml:space="preserve">Piktogramy określające rodzaj zagrożenia i hasło ostrzegawcze:</w:t>
       </w:r>
     </w:p>
     <w:p>
@@ -808,56 +1144,22 @@
           <w:sz w:val="20"/>
           <w:szCs w:val="20"/>
         </w:rPr>
-        <w:t xml:space="preserve">GHS02, GHS07</w:t>
-      </w:r>
-    </w:p>
-    <w:p>
-      <w:pPr>
-        <w:spacing w:after="80" w:before="80"/>
-      </w:pPr>
-      <w:r>
-        <w:rPr>
-          <w:rFonts w:ascii="Arial" w:cs="Arial" w:eastAsia="Arial" w:hAnsi="Arial"/>
-          <w:b/>
-          <w:bCs/>
-          <w:sz w:val="20"/>
-          <w:szCs w:val="20"/>
-        </w:rPr>
-        <w:t xml:space="preserve">Hasło ostrzegawcze:</w:t>
-      </w:r>
-      <w:r>
-        <w:rPr>
-          <w:rFonts w:ascii="Arial" w:cs="Arial" w:eastAsia="Arial" w:hAnsi="Arial"/>
-          <w:sz w:val="20"/>
-          <w:szCs w:val="20"/>
-        </w:rPr>
-        <w:t xml:space="preserve"/>
-      </w:r>
-    </w:p>
-    <w:p>
-      <w:pPr>
-        <w:spacing w:after="80"/>
-      </w:pPr>
-      <w:r>
-        <w:rPr>
-          <w:rFonts w:ascii="Arial" w:cs="Arial" w:eastAsia="Arial" w:hAnsi="Arial"/>
-          <w:sz w:val="20"/>
-          <w:szCs w:val="20"/>
-        </w:rPr>
         <w:t xml:space="preserve">Niebezpieczeństwo</w:t>
       </w:r>
     </w:p>
     <w:p>
       <w:pPr>
-        <w:spacing w:after="80"/>
-      </w:pPr>
-      <w:r>
-        <w:rPr>
-          <w:rFonts w:ascii="Arial" w:cs="Arial" w:eastAsia="Arial" w:hAnsi="Arial"/>
-          <w:sz w:val="20"/>
-          <w:szCs w:val="20"/>
-        </w:rPr>
-        <w:t xml:space="preserve">Nazwy niebezpiecznych substancji wymienione na etykiecie:</w:t>
+        <w:spacing w:after="80" w:before="150"/>
+      </w:pPr>
+      <w:r>
+        <w:rPr>
+          <w:rFonts w:ascii="Arial" w:cs="Arial" w:eastAsia="Arial" w:hAnsi="Arial"/>
+          <w:b/>
+          <w:bCs/>
+          <w:sz w:val="20"/>
+          <w:szCs w:val="20"/>
+        </w:rPr>
+        <w:t xml:space="preserve">Nazwy niebezpiecznych substancji wymienione na etykiecie</w:t>
       </w:r>
     </w:p>
     <w:p>
@@ -875,15 +1177,17 @@
     </w:p>
     <w:p>
       <w:pPr>
-        <w:spacing w:after="80"/>
-      </w:pPr>
-      <w:r>
-        <w:rPr>
-          <w:rFonts w:ascii="Arial" w:cs="Arial" w:eastAsia="Arial" w:hAnsi="Arial"/>
-          <w:sz w:val="20"/>
-          <w:szCs w:val="20"/>
-        </w:rPr>
-        <w:t xml:space="preserve">Zwroty wskazujące rodzaj zagrożenia:</w:t>
+        <w:spacing w:after="80" w:before="150"/>
+      </w:pPr>
+      <w:r>
+        <w:rPr>
+          <w:rFonts w:ascii="Arial" w:cs="Arial" w:eastAsia="Arial" w:hAnsi="Arial"/>
+          <w:b/>
+          <w:bCs/>
+          <w:sz w:val="20"/>
+          <w:szCs w:val="20"/>
+        </w:rPr>
+        <w:t xml:space="preserve">Zwroty wskazujące rodzaj zagrożenia</w:t>
       </w:r>
     </w:p>
     <w:p>
@@ -927,15 +1231,17 @@
     </w:p>
     <w:p>
       <w:pPr>
-        <w:spacing w:after="80"/>
-      </w:pPr>
-      <w:r>
-        <w:rPr>
-          <w:rFonts w:ascii="Arial" w:cs="Arial" w:eastAsia="Arial" w:hAnsi="Arial"/>
-          <w:sz w:val="20"/>
-          <w:szCs w:val="20"/>
-        </w:rPr>
-        <w:t xml:space="preserve">Zwroty wskazujące środki ostrożności:</w:t>
+        <w:spacing w:after="80" w:before="150"/>
+      </w:pPr>
+      <w:r>
+        <w:rPr>
+          <w:rFonts w:ascii="Arial" w:cs="Arial" w:eastAsia="Arial" w:hAnsi="Arial"/>
+          <w:b/>
+          <w:bCs/>
+          <w:sz w:val="20"/>
+          <w:szCs w:val="20"/>
+        </w:rPr>
+        <w:t xml:space="preserve">Zwroty wskazujące środki ostrożności</w:t>
       </w:r>
     </w:p>
     <w:p>
@@ -1018,15 +1324,17 @@
     </w:p>
     <w:p>
       <w:pPr>
-        <w:spacing w:after="80"/>
-      </w:pPr>
-      <w:r>
-        <w:rPr>
-          <w:rFonts w:ascii="Arial" w:cs="Arial" w:eastAsia="Arial" w:hAnsi="Arial"/>
-          <w:sz w:val="20"/>
-          <w:szCs w:val="20"/>
-        </w:rPr>
-        <w:t xml:space="preserve">Informacje uzupełniające:</w:t>
+        <w:spacing w:after="80" w:before="150"/>
+      </w:pPr>
+      <w:r>
+        <w:rPr>
+          <w:rFonts w:ascii="Arial" w:cs="Arial" w:eastAsia="Arial" w:hAnsi="Arial"/>
+          <w:b/>
+          <w:bCs/>
+          <w:sz w:val="20"/>
+          <w:szCs w:val="20"/>
+        </w:rPr>
+        <w:t xml:space="preserve">Informacje uzupełniające</w:t>
       </w:r>
     </w:p>
     <w:p>
@@ -1067,7 +1375,7 @@
           <w:sz w:val="20"/>
           <w:szCs w:val="20"/>
         </w:rPr>
-        <w:t xml:space="preserve">Substancje zaburzające funkcjonowanie układu hormonalnego: Produkt zawiera galaksolid (1,3,4,6,7,8-heksahydro-4,6,6,7,8,8-heksametyloindeno[5,6-c]piran) (CAS: 1222-05-5) podlegający ocenie pod kątem właściwości zaburzających funkcjonowanie układu hormonalnego w odniesieniu do środowiska zgodnie z kryteriami określonymi w rozporządzeniu (UE) 2017/2100 lub rozporządzeniu (UE) 2018/605 (szczegółowe dane w sekcji 12.6).</w:t>
+        <w:t xml:space="preserve">Substancje zaburzające funkcjonowanie układu hormonalnego: Produkt zawiera galaksolid (1,3,4,6,7,8-heksahydro-4,6,6,7,8,8-heksametyloindeno[5,6-c]piran) (CAS: 1222-05-5) podlegającą ocenie pod kątem właściwości zaburzających funkcjonowanie układu hormonalnego w odniesieniu do środowiska zgodnie z kryteriami określonymi w rozporządzeniu (UE) 2017/2100 lub rozporządzeniu (UE) 2018/605 (szczegółowe dane w sekcji 12.6).</w:t>
       </w:r>
     </w:p>
     <w:p>
@@ -2888,30 +3196,7 @@
           <w:sz w:val="20"/>
           <w:szCs w:val="20"/>
         </w:rPr>
-        <w:t xml:space="preserve">5.1. Środki gaśnicze</w:t>
-      </w:r>
-    </w:p>
-    <w:p>
-      <w:pPr>
-        <w:spacing w:after="80" w:before="80"/>
-      </w:pPr>
-      <w:r>
-        <w:rPr>
-          <w:rFonts w:ascii="Arial" w:cs="Arial" w:eastAsia="Arial" w:hAnsi="Arial"/>
-          <w:b/>
-          <w:bCs/>
-          <w:sz w:val="20"/>
-          <w:szCs w:val="20"/>
-        </w:rPr>
-        <w:t xml:space="preserve">Odpowiednie środki gaśnicze:</w:t>
-      </w:r>
-      <w:r>
-        <w:rPr>
-          <w:rFonts w:ascii="Arial" w:cs="Arial" w:eastAsia="Arial" w:hAnsi="Arial"/>
-          <w:sz w:val="20"/>
-          <w:szCs w:val="20"/>
-        </w:rPr>
-        <w:t xml:space="preserve"> piana gaśnicza, proszek gaśniczy, dwutlenek węgla.</w:t>
+        <w:t xml:space="preserve">5.1. Środki gaśnicze: piana, proszek gaśniczy, CO2.</w:t>
       </w:r>
     </w:p>
     <w:p>
@@ -2943,7 +3228,7 @@
           <w:sz w:val="20"/>
           <w:szCs w:val="20"/>
         </w:rPr>
-        <w:t xml:space="preserve">6.1. Indywidualne środki ostrożności: usunąć wszelkie źródła zapłonu.</w:t>
+        <w:t xml:space="preserve">6.1. Środki ostrożności: usunąć źródła zapłonu.</w:t>
       </w:r>
     </w:p>
     <w:p>
@@ -2975,7 +3260,7 @@
           <w:sz w:val="20"/>
           <w:szCs w:val="20"/>
         </w:rPr>
-        <w:t xml:space="preserve">7.1. Środki ostrożności dotyczące bezpiecznego postępowania: unikać kontaktu z oczami i skórą.</w:t>
+        <w:t xml:space="preserve">7.1. Środki ostrożności: zapewnić wentylację.</w:t>
       </w:r>
     </w:p>
     <w:p>
@@ -6674,7 +6959,7 @@
           <w:sz w:val="20"/>
           <w:szCs w:val="20"/>
         </w:rPr>
-        <w:t xml:space="preserve"> jasnoniebieski (ocena wizualna)</w:t>
+        <w:t xml:space="preserve"> light niebieski Remark:Visual</w:t>
       </w:r>
     </w:p>
     <w:p>
@@ -6766,7 +7051,7 @@
           <w:sz w:val="20"/>
           <w:szCs w:val="20"/>
         </w:rPr>
-        <w:t xml:space="preserve"> wysoce łatwopalna ciecz i pary</w:t>
+        <w:t xml:space="preserve"> Easily ciecz łatwopalna and</w:t>
       </w:r>
     </w:p>
     <w:p>
@@ -6904,7 +7189,7 @@
           <w:sz w:val="20"/>
           <w:szCs w:val="20"/>
         </w:rPr>
-        <w:t xml:space="preserve"> brak danych</w:t>
+        <w:t xml:space="preserve"> Brak danych</w:t>
       </w:r>
     </w:p>
     <w:p>
@@ -6950,7 +7235,7 @@
           <w:sz w:val="20"/>
           <w:szCs w:val="20"/>
         </w:rPr>
-        <w:t xml:space="preserve"> nie dotyczy</w:t>
+        <w:t xml:space="preserve"> Nie dotyczy</w:t>
       </w:r>
     </w:p>
     <w:p>
@@ -6996,7 +7281,7 @@
           <w:sz w:val="20"/>
           <w:szCs w:val="20"/>
         </w:rPr>
-        <w:t xml:space="preserve"> 5,9 kPa (metoda: INRS, 2011)</w:t>
+        <w:t xml:space="preserve"> 5,9 kPa Method:INRS, 2011</w:t>
       </w:r>
     </w:p>
     <w:p>
@@ -7019,7 +7304,7 @@
           <w:sz w:val="20"/>
           <w:szCs w:val="20"/>
         </w:rPr>
-        <w:t xml:space="preserve"> brak danych</w:t>
+        <w:t xml:space="preserve"> Brak danych</w:t>
       </w:r>
     </w:p>
     <w:p>
@@ -7065,7 +7350,7 @@
           <w:sz w:val="20"/>
           <w:szCs w:val="20"/>
         </w:rPr>
-        <w:t xml:space="preserve"> nie dotyczy (produkt płynny)</w:t>
+        <w:t xml:space="preserve"> Nie dotyczy (produkt płynny)</w:t>
       </w:r>
     </w:p>
     <w:p>
@@ -7187,32 +7472,6 @@
     </w:p>
     <w:p>
       <w:pPr>
-        <w:spacing w:after="80"/>
-      </w:pPr>
-      <w:r>
-        <w:rPr>
-          <w:rFonts w:ascii="Arial" w:cs="Arial" w:eastAsia="Arial" w:hAnsi="Arial"/>
-          <w:sz w:val="20"/>
-          <w:szCs w:val="20"/>
-        </w:rPr>
-        <w:t xml:space="preserve">Wobec braku danych doświadczalnych dla samego produktu, zagrożenia dla zdrowia ocenia się zgodnie z właściwościami substancji składowych, z zastosowaniem kryteriów określonych w obowiązujących przepisach dotyczących klasyfikacji.</w:t>
-      </w:r>
-    </w:p>
-    <w:p>
-      <w:pPr>
-        <w:spacing w:after="80"/>
-      </w:pPr>
-      <w:r>
-        <w:rPr>
-          <w:rFonts w:ascii="Arial" w:cs="Arial" w:eastAsia="Arial" w:hAnsi="Arial"/>
-          <w:sz w:val="20"/>
-          <w:szCs w:val="20"/>
-        </w:rPr>
-        <w:t xml:space="preserve">W związku z tym w celu oceny skutków toksykologicznych narażenia na produkt należy uwzględnić stężenia poszczególnych substancji niebezpiecznych wymienionych w sekcji 3.</w:t>
-      </w:r>
-    </w:p>
-    <w:p>
-      <w:pPr>
         <w:spacing w:after="100" w:before="200"/>
       </w:pPr>
       <w:r>
@@ -7223,962 +7482,7 @@
           <w:sz w:val="20"/>
           <w:szCs w:val="20"/>
         </w:rPr>
-        <w:t xml:space="preserve">11.1. Informacje na temat klas zagrożenia zdefiniowanych w rozporządzeniu (WE) nr 1272/2008</w:t>
-      </w:r>
-    </w:p>
-    <w:p>
-      <w:pPr>
-        <w:spacing w:after="80"/>
-      </w:pPr>
-      <w:r>
-        <w:rPr>
-          <w:rFonts w:ascii="Arial" w:cs="Arial" w:eastAsia="Arial" w:hAnsi="Arial"/>
-          <w:sz w:val="20"/>
-          <w:szCs w:val="20"/>
-        </w:rPr>
-        <w:t xml:space="preserve">Metabolizm, toksykokinetyka, mechanizm działania i inne informacje:</w:t>
-      </w:r>
-    </w:p>
-    <w:p>
-      <w:pPr>
-        <w:spacing w:after="80"/>
-      </w:pPr>
-      <w:r>
-        <w:rPr>
-          <w:rFonts w:ascii="Arial" w:cs="Arial" w:eastAsia="Arial" w:hAnsi="Arial"/>
-          <w:sz w:val="20"/>
-          <w:szCs w:val="20"/>
-        </w:rPr>
-        <w:t xml:space="preserve">Brak dostępnych informacji.</w:t>
-      </w:r>
-    </w:p>
-    <w:p>
-      <w:pPr>
-        <w:spacing w:after="80"/>
-      </w:pPr>
-      <w:r>
-        <w:rPr>
-          <w:rFonts w:ascii="Arial" w:cs="Arial" w:eastAsia="Arial" w:hAnsi="Arial"/>
-          <w:sz w:val="20"/>
-          <w:szCs w:val="20"/>
-        </w:rPr>
-        <w:t xml:space="preserve">Informacje dotyczące prawdopodobnych dróg narażenia:</w:t>
-      </w:r>
-    </w:p>
-    <w:p>
-      <w:pPr>
-        <w:spacing w:after="80"/>
-      </w:pPr>
-      <w:r>
-        <w:rPr>
-          <w:rFonts w:ascii="Arial" w:cs="Arial" w:eastAsia="Arial" w:hAnsi="Arial"/>
-          <w:sz w:val="20"/>
-          <w:szCs w:val="20"/>
-        </w:rPr>
-        <w:t xml:space="preserve">METANOL:</w:t>
-      </w:r>
-    </w:p>
-    <w:p>
-      <w:pPr>
-        <w:spacing w:after="80"/>
-      </w:pPr>
-      <w:r>
-        <w:rPr>
-          <w:rFonts w:ascii="Arial" w:cs="Arial" w:eastAsia="Arial" w:hAnsi="Arial"/>
-          <w:sz w:val="20"/>
-          <w:szCs w:val="20"/>
-        </w:rPr>
-        <w:t xml:space="preserve">PRACOWNICY: przez drogi oddechowe (inhalacyjnie); kontakt ze skórą.</w:t>
-      </w:r>
-    </w:p>
-    <w:p>
-      <w:pPr>
-        <w:spacing w:after="80"/>
-      </w:pPr>
-      <w:r>
-        <w:rPr>
-          <w:rFonts w:ascii="Arial" w:cs="Arial" w:eastAsia="Arial" w:hAnsi="Arial"/>
-          <w:sz w:val="20"/>
-          <w:szCs w:val="20"/>
-        </w:rPr>
-        <w:t xml:space="preserve">LUDNOŚĆ: spożycie skażonej żywności lub wody; kontakt ze skórą w przypadku produktów zawierających substancję.</w:t>
-      </w:r>
-    </w:p>
-    <w:p>
-      <w:pPr>
-        <w:spacing w:after="80"/>
-      </w:pPr>
-      <w:r>
-        <w:rPr>
-          <w:rFonts w:ascii="Arial" w:cs="Arial" w:eastAsia="Arial" w:hAnsi="Arial"/>
-          <w:sz w:val="20"/>
-          <w:szCs w:val="20"/>
-        </w:rPr>
-        <w:t xml:space="preserve">TOLUEN:</w:t>
-      </w:r>
-    </w:p>
-    <w:p>
-      <w:pPr>
-        <w:spacing w:after="80"/>
-      </w:pPr>
-      <w:r>
-        <w:rPr>
-          <w:rFonts w:ascii="Arial" w:cs="Arial" w:eastAsia="Arial" w:hAnsi="Arial"/>
-          <w:sz w:val="20"/>
-          <w:szCs w:val="20"/>
-        </w:rPr>
-        <w:t xml:space="preserve">PRACOWNICY: przez drogi oddechowe (inhalacyjnie); kontakt ze skórą.</w:t>
-      </w:r>
-    </w:p>
-    <w:p>
-      <w:pPr>
-        <w:spacing w:after="80"/>
-      </w:pPr>
-      <w:r>
-        <w:rPr>
-          <w:rFonts w:ascii="Arial" w:cs="Arial" w:eastAsia="Arial" w:hAnsi="Arial"/>
-          <w:sz w:val="20"/>
-          <w:szCs w:val="20"/>
-        </w:rPr>
-        <w:t xml:space="preserve">LUDNOŚĆ: spożycie skażonej żywności lub wody; wdychanie powietrza otoczenia; kontakt ze skórą w przypadku produktów zawierających substancję.</w:t>
-      </w:r>
-    </w:p>
-    <w:p>
-      <w:pPr>
-        <w:spacing w:after="80"/>
-      </w:pPr>
-      <w:r>
-        <w:rPr>
-          <w:rFonts w:ascii="Arial" w:cs="Arial" w:eastAsia="Arial" w:hAnsi="Arial"/>
-          <w:sz w:val="20"/>
-          <w:szCs w:val="20"/>
-        </w:rPr>
-        <w:t xml:space="preserve">Opóźnione, bezpośrednie oraz przewlekłe skutki krótko- i długotrwałego narażenia:</w:t>
-      </w:r>
-    </w:p>
-    <w:p>
-      <w:pPr>
-        <w:spacing w:after="80"/>
-      </w:pPr>
-      <w:r>
-        <w:rPr>
-          <w:rFonts w:ascii="Arial" w:cs="Arial" w:eastAsia="Arial" w:hAnsi="Arial"/>
-          <w:sz w:val="20"/>
-          <w:szCs w:val="20"/>
-        </w:rPr>
-        <w:t xml:space="preserve">METANOL:</w:t>
-      </w:r>
-    </w:p>
-    <w:p>
-      <w:pPr>
-        <w:spacing w:after="80"/>
-      </w:pPr>
-      <w:r>
-        <w:rPr>
-          <w:rFonts w:ascii="Arial" w:cs="Arial" w:eastAsia="Arial" w:hAnsi="Arial"/>
-          <w:sz w:val="20"/>
-          <w:szCs w:val="20"/>
-        </w:rPr>
-        <w:t xml:space="preserve">Minimalną śmiertelną dawkę dla człowieka drogą pokarmową szacuje się w zakresie od 300 do 1000 mg/kg mc. Spożycie 4–10 ml substancji może spowodować trwałą ślepotę u dorosłego człowieka (IPCS).</w:t>
-      </w:r>
-    </w:p>
-    <w:p>
-      <w:pPr>
-        <w:spacing w:after="80"/>
-      </w:pPr>
-      <w:r>
-        <w:rPr>
-          <w:rFonts w:ascii="Arial" w:cs="Arial" w:eastAsia="Arial" w:hAnsi="Arial"/>
-          <w:sz w:val="20"/>
-          <w:szCs w:val="20"/>
-        </w:rPr>
-        <w:t xml:space="preserve">TOLUEN:</w:t>
-      </w:r>
-    </w:p>
-    <w:p>
-      <w:pPr>
-        <w:spacing w:after="80"/>
-      </w:pPr>
-      <w:r>
-        <w:rPr>
-          <w:rFonts w:ascii="Arial" w:cs="Arial" w:eastAsia="Arial" w:hAnsi="Arial"/>
-          <w:sz w:val="20"/>
-          <w:szCs w:val="20"/>
-        </w:rPr>
-        <w:t xml:space="preserve">Działanie toksyczne na ośrodkowy i obwodowy układ nerwowy z encefalopatią i zapaleniem wielonerwowym; działanie drażniące na skórę, spojówki, rogówkę i drogi oddechowe.</w:t>
-      </w:r>
-    </w:p>
-    <w:p>
-      <w:pPr>
-        <w:spacing w:after="80"/>
-      </w:pPr>
-      <w:r>
-        <w:rPr>
-          <w:rFonts w:ascii="Arial" w:cs="Arial" w:eastAsia="Arial" w:hAnsi="Arial"/>
-          <w:sz w:val="20"/>
-          <w:szCs w:val="20"/>
-        </w:rPr>
-        <w:t xml:space="preserve">Skutki wzajemnego oddziaływania:</w:t>
-      </w:r>
-    </w:p>
-    <w:p>
-      <w:pPr>
-        <w:spacing w:after="80"/>
-      </w:pPr>
-      <w:r>
-        <w:rPr>
-          <w:rFonts w:ascii="Arial" w:cs="Arial" w:eastAsia="Arial" w:hAnsi="Arial"/>
-          <w:sz w:val="20"/>
-          <w:szCs w:val="20"/>
-        </w:rPr>
-        <w:t xml:space="preserve">TOLUEN:</w:t>
-      </w:r>
-    </w:p>
-    <w:p>
-      <w:pPr>
-        <w:spacing w:after="80"/>
-      </w:pPr>
-      <w:r>
-        <w:rPr>
-          <w:rFonts w:ascii="Arial" w:cs="Arial" w:eastAsia="Arial" w:hAnsi="Arial"/>
-          <w:sz w:val="20"/>
-          <w:szCs w:val="20"/>
-        </w:rPr>
-        <w:t xml:space="preserve">Niektóre leki i inne związki przemysłowe mogą zakłócać metabolizm toluenu.</w:t>
-      </w:r>
-    </w:p>
-    <w:p>
-      <w:pPr>
-        <w:spacing w:after="80"/>
-      </w:pPr>
-      <w:r>
-        <w:rPr>
-          <w:rFonts w:ascii="Arial" w:cs="Arial" w:eastAsia="Arial" w:hAnsi="Arial"/>
-          <w:sz w:val="20"/>
-          <w:szCs w:val="20"/>
-        </w:rPr>
-        <w:t xml:space="preserve">Toksyczność ostra:</w:t>
-      </w:r>
-    </w:p>
-    <w:p>
-      <w:pPr>
-        <w:spacing w:after="80"/>
-      </w:pPr>
-      <w:r>
-        <w:rPr>
-          <w:rFonts w:ascii="Arial" w:cs="Arial" w:eastAsia="Arial" w:hAnsi="Arial"/>
-          <w:sz w:val="20"/>
-          <w:szCs w:val="20"/>
-        </w:rPr>
-        <w:t xml:space="preserve">ATE mieszaniny (inhalacyjnie): Nie sklasyfikowano (brak istotnych składników podlegających sumowaniu powyżej progów odcięcia)</w:t>
-      </w:r>
-    </w:p>
-    <w:p>
-      <w:pPr>
-        <w:spacing w:after="80"/>
-      </w:pPr>
-      <w:r>
-        <w:rPr>
-          <w:rFonts w:ascii="Arial" w:cs="Arial" w:eastAsia="Arial" w:hAnsi="Arial"/>
-          <w:sz w:val="20"/>
-          <w:szCs w:val="20"/>
-        </w:rPr>
-        <w:t xml:space="preserve">ATE mieszaniny (droga pokarmowa): Nie sklasyfikowano (brak istotnych składników podlegających sumowaniu powyżej progów odcięcia)</w:t>
-      </w:r>
-    </w:p>
-    <w:p>
-      <w:pPr>
-        <w:spacing w:after="80"/>
-      </w:pPr>
-      <w:r>
-        <w:rPr>
-          <w:rFonts w:ascii="Arial" w:cs="Arial" w:eastAsia="Arial" w:hAnsi="Arial"/>
-          <w:sz w:val="20"/>
-          <w:szCs w:val="20"/>
-        </w:rPr>
-        <w:t xml:space="preserve">ATE mieszaniny (skóra): Nie sklasyfikowano (brak istotnych składników podlegających sumowaniu powyżej progów odcięcia)</w:t>
-      </w:r>
-    </w:p>
-    <w:p>
-      <w:pPr>
-        <w:spacing w:after="80"/>
-      </w:pPr>
-      <w:r>
-        <w:rPr>
-          <w:rFonts w:ascii="Arial" w:cs="Arial" w:eastAsia="Arial" w:hAnsi="Arial"/>
-          <w:sz w:val="20"/>
-          <w:szCs w:val="20"/>
-        </w:rPr>
-        <w:t xml:space="preserve">Dane dotyczące składników:</w:t>
-      </w:r>
-    </w:p>
-    <w:p>
-      <w:pPr>
-        <w:spacing w:after="80"/>
-      </w:pPr>
-      <w:r>
-        <w:rPr>
-          <w:rFonts w:ascii="Arial" w:cs="Arial" w:eastAsia="Arial" w:hAnsi="Arial"/>
-          <w:sz w:val="20"/>
-          <w:szCs w:val="20"/>
-        </w:rPr>
-        <w:t xml:space="preserve">Etanol:</w:t>
-      </w:r>
-    </w:p>
-    <w:p>
-      <w:pPr>
-        <w:spacing w:after="80"/>
-      </w:pPr>
-      <w:r>
-        <w:rPr>
-          <w:rFonts w:ascii="Arial" w:cs="Arial" w:eastAsia="Arial" w:hAnsi="Arial"/>
-          <w:sz w:val="20"/>
-          <w:szCs w:val="20"/>
-        </w:rPr>
-        <w:t xml:space="preserve">LD50 (droga pokarmowa, szczur): &gt; 5000 mg/kg mc.</w:t>
-      </w:r>
-    </w:p>
-    <w:p>
-      <w:pPr>
-        <w:spacing w:after="80"/>
-      </w:pPr>
-      <w:r>
-        <w:rPr>
-          <w:rFonts w:ascii="Arial" w:cs="Arial" w:eastAsia="Arial" w:hAnsi="Arial"/>
-          <w:sz w:val="20"/>
-          <w:szCs w:val="20"/>
-        </w:rPr>
-        <w:t xml:space="preserve">LC50 (drogi oddechowe, pary, szczur): &gt; 50 mg/l/4h</w:t>
-      </w:r>
-    </w:p>
-    <w:p>
-      <w:pPr>
-        <w:spacing w:after="80"/>
-      </w:pPr>
-      <w:r>
-        <w:rPr>
-          <w:rFonts w:ascii="Arial" w:cs="Arial" w:eastAsia="Arial" w:hAnsi="Arial"/>
-          <w:sz w:val="20"/>
-          <w:szCs w:val="20"/>
-        </w:rPr>
-        <w:t xml:space="preserve">Salicylan benzylu:</w:t>
-      </w:r>
-    </w:p>
-    <w:p>
-      <w:pPr>
-        <w:spacing w:after="80"/>
-      </w:pPr>
-      <w:r>
-        <w:rPr>
-          <w:rFonts w:ascii="Arial" w:cs="Arial" w:eastAsia="Arial" w:hAnsi="Arial"/>
-          <w:sz w:val="20"/>
-          <w:szCs w:val="20"/>
-        </w:rPr>
-        <w:t xml:space="preserve">LD50 (na skórę, królik): &gt; 2000 mg/kg mc.</w:t>
-      </w:r>
-    </w:p>
-    <w:p>
-      <w:pPr>
-        <w:spacing w:after="80"/>
-      </w:pPr>
-      <w:r>
-        <w:rPr>
-          <w:rFonts w:ascii="Arial" w:cs="Arial" w:eastAsia="Arial" w:hAnsi="Arial"/>
-          <w:sz w:val="20"/>
-          <w:szCs w:val="20"/>
-        </w:rPr>
-        <w:t xml:space="preserve">LD50 (droga pokarmowa, szczur): &gt; 2000 mg/kg mc.</w:t>
-      </w:r>
-    </w:p>
-    <w:p>
-      <w:pPr>
-        <w:spacing w:after="80"/>
-      </w:pPr>
-      <w:r>
-        <w:rPr>
-          <w:rFonts w:ascii="Arial" w:cs="Arial" w:eastAsia="Arial" w:hAnsi="Arial"/>
-          <w:sz w:val="20"/>
-          <w:szCs w:val="20"/>
-        </w:rPr>
-        <w:t xml:space="preserve">Galaksolid:</w:t>
-      </w:r>
-    </w:p>
-    <w:p>
-      <w:pPr>
-        <w:spacing w:after="80"/>
-      </w:pPr>
-      <w:r>
-        <w:rPr>
-          <w:rFonts w:ascii="Arial" w:cs="Arial" w:eastAsia="Arial" w:hAnsi="Arial"/>
-          <w:sz w:val="20"/>
-          <w:szCs w:val="20"/>
-        </w:rPr>
-        <w:t xml:space="preserve">LD50 (na skórę, królik): &gt; 5000 mg/kg mc.</w:t>
-      </w:r>
-    </w:p>
-    <w:p>
-      <w:pPr>
-        <w:spacing w:after="80"/>
-      </w:pPr>
-      <w:r>
-        <w:rPr>
-          <w:rFonts w:ascii="Arial" w:cs="Arial" w:eastAsia="Arial" w:hAnsi="Arial"/>
-          <w:sz w:val="20"/>
-          <w:szCs w:val="20"/>
-        </w:rPr>
-        <w:t xml:space="preserve">LD50 (droga pokarmowa, szczur): &gt; 4640 mg/kg mc.</w:t>
-      </w:r>
-    </w:p>
-    <w:p>
-      <w:pPr>
-        <w:spacing w:after="80"/>
-      </w:pPr>
-      <w:r>
-        <w:rPr>
-          <w:rFonts w:ascii="Arial" w:cs="Arial" w:eastAsia="Arial" w:hAnsi="Arial"/>
-          <w:sz w:val="20"/>
-          <w:szCs w:val="20"/>
-        </w:rPr>
-        <w:t xml:space="preserve">Kumaryna:</w:t>
-      </w:r>
-    </w:p>
-    <w:p>
-      <w:pPr>
-        <w:spacing w:after="80"/>
-      </w:pPr>
-      <w:r>
-        <w:rPr>
-          <w:rFonts w:ascii="Arial" w:cs="Arial" w:eastAsia="Arial" w:hAnsi="Arial"/>
-          <w:sz w:val="20"/>
-          <w:szCs w:val="20"/>
-        </w:rPr>
-        <w:t xml:space="preserve">LD50 (na skórę, szczur): 293 mg/kg mc.</w:t>
-      </w:r>
-    </w:p>
-    <w:p>
-      <w:pPr>
-        <w:spacing w:after="80"/>
-      </w:pPr>
-      <w:r>
-        <w:rPr>
-          <w:rFonts w:ascii="Arial" w:cs="Arial" w:eastAsia="Arial" w:hAnsi="Arial"/>
-          <w:sz w:val="20"/>
-          <w:szCs w:val="20"/>
-        </w:rPr>
-        <w:t xml:space="preserve">LD50 (droga pokarmowa, szczur): 290 mg/kg mc.</w:t>
-      </w:r>
-    </w:p>
-    <w:p>
-      <w:pPr>
-        <w:spacing w:after="80"/>
-      </w:pPr>
-      <w:r>
-        <w:rPr>
-          <w:rFonts w:ascii="Arial" w:cs="Arial" w:eastAsia="Arial" w:hAnsi="Arial"/>
-          <w:sz w:val="20"/>
-          <w:szCs w:val="20"/>
-        </w:rPr>
-        <w:t xml:space="preserve">LC50 (drogi oddechowe, aerozole/pyły, szczur): 293 mg/m³</w:t>
-      </w:r>
-    </w:p>
-    <w:p>
-      <w:pPr>
-        <w:spacing w:after="80"/>
-      </w:pPr>
-      <w:r>
-        <w:rPr>
-          <w:rFonts w:ascii="Arial" w:cs="Arial" w:eastAsia="Arial" w:hAnsi="Arial"/>
-          <w:sz w:val="20"/>
-          <w:szCs w:val="20"/>
-        </w:rPr>
-        <w:t xml:space="preserve">2,6-di-tert-butylo-4-metylofenol (BHT):</w:t>
-      </w:r>
-    </w:p>
-    <w:p>
-      <w:pPr>
-        <w:spacing w:after="80"/>
-      </w:pPr>
-      <w:r>
-        <w:rPr>
-          <w:rFonts w:ascii="Arial" w:cs="Arial" w:eastAsia="Arial" w:hAnsi="Arial"/>
-          <w:sz w:val="20"/>
-          <w:szCs w:val="20"/>
-        </w:rPr>
-        <w:t xml:space="preserve">LD50 (na skórę, szczur): &gt; 2000 mg/kg mc.</w:t>
-      </w:r>
-    </w:p>
-    <w:p>
-      <w:pPr>
-        <w:spacing w:after="80"/>
-      </w:pPr>
-      <w:r>
-        <w:rPr>
-          <w:rFonts w:ascii="Arial" w:cs="Arial" w:eastAsia="Arial" w:hAnsi="Arial"/>
-          <w:sz w:val="20"/>
-          <w:szCs w:val="20"/>
-        </w:rPr>
-        <w:t xml:space="preserve">LD50 (droga pokarmowa, szczur): 2930 mg/kg mc.</w:t>
-      </w:r>
-    </w:p>
-    <w:p>
-      <w:pPr>
-        <w:spacing w:after="80"/>
-      </w:pPr>
-      <w:r>
-        <w:rPr>
-          <w:rFonts w:ascii="Arial" w:cs="Arial" w:eastAsia="Arial" w:hAnsi="Arial"/>
-          <w:sz w:val="20"/>
-          <w:szCs w:val="20"/>
-        </w:rPr>
-        <w:t xml:space="preserve">Hydroksycytronellal:</w:t>
-      </w:r>
-    </w:p>
-    <w:p>
-      <w:pPr>
-        <w:spacing w:after="80"/>
-      </w:pPr>
-      <w:r>
-        <w:rPr>
-          <w:rFonts w:ascii="Arial" w:cs="Arial" w:eastAsia="Arial" w:hAnsi="Arial"/>
-          <w:sz w:val="20"/>
-          <w:szCs w:val="20"/>
-        </w:rPr>
-        <w:t xml:space="preserve">LD50 (na skórę, królik): &gt; 2000 mg/kg mc.</w:t>
-      </w:r>
-    </w:p>
-    <w:p>
-      <w:pPr>
-        <w:spacing w:after="80"/>
-      </w:pPr>
-      <w:r>
-        <w:rPr>
-          <w:rFonts w:ascii="Arial" w:cs="Arial" w:eastAsia="Arial" w:hAnsi="Arial"/>
-          <w:sz w:val="20"/>
-          <w:szCs w:val="20"/>
-        </w:rPr>
-        <w:t xml:space="preserve">LD50 (droga pokarmowa, szczur): &gt; 5000 mg/kg mc.</w:t>
-      </w:r>
-    </w:p>
-    <w:p>
-      <w:pPr>
-        <w:spacing w:after="80"/>
-      </w:pPr>
-      <w:r>
-        <w:rPr>
-          <w:rFonts w:ascii="Arial" w:cs="Arial" w:eastAsia="Arial" w:hAnsi="Arial"/>
-          <w:sz w:val="20"/>
-          <w:szCs w:val="20"/>
-        </w:rPr>
-        <w:t xml:space="preserve">Metanol:</w:t>
-      </w:r>
-    </w:p>
-    <w:p>
-      <w:pPr>
-        <w:spacing w:after="80"/>
-      </w:pPr>
-      <w:r>
-        <w:rPr>
-          <w:rFonts w:ascii="Arial" w:cs="Arial" w:eastAsia="Arial" w:hAnsi="Arial"/>
-          <w:sz w:val="20"/>
-          <w:szCs w:val="20"/>
-        </w:rPr>
-        <w:t xml:space="preserve">LD50 (droga pokarmowa, szczur): &gt; 1187 mg/kg mc.</w:t>
-      </w:r>
-    </w:p>
-    <w:p>
-      <w:pPr>
-        <w:spacing w:after="80"/>
-      </w:pPr>
-      <w:r>
-        <w:rPr>
-          <w:rFonts w:ascii="Arial" w:cs="Arial" w:eastAsia="Arial" w:hAnsi="Arial"/>
-          <w:sz w:val="20"/>
-          <w:szCs w:val="20"/>
-        </w:rPr>
-        <w:t xml:space="preserve">LC50 (drogi oddechowe, pary, szczur): 43,68 mg/l/6h</w:t>
-      </w:r>
-    </w:p>
-    <w:p>
-      <w:pPr>
-        <w:spacing w:after="80"/>
-      </w:pPr>
-      <w:r>
-        <w:rPr>
-          <w:rFonts w:ascii="Arial" w:cs="Arial" w:eastAsia="Arial" w:hAnsi="Arial"/>
-          <w:sz w:val="20"/>
-          <w:szCs w:val="20"/>
-        </w:rPr>
-        <w:t xml:space="preserve">Toluen:</w:t>
-      </w:r>
-    </w:p>
-    <w:p>
-      <w:pPr>
-        <w:spacing w:after="80"/>
-      </w:pPr>
-      <w:r>
-        <w:rPr>
-          <w:rFonts w:ascii="Arial" w:cs="Arial" w:eastAsia="Arial" w:hAnsi="Arial"/>
-          <w:sz w:val="20"/>
-          <w:szCs w:val="20"/>
-        </w:rPr>
-        <w:t xml:space="preserve">LD50 (na skórę, królik): &gt; 5000 mg/kg mc.</w:t>
-      </w:r>
-    </w:p>
-    <w:p>
-      <w:pPr>
-        <w:spacing w:after="80"/>
-      </w:pPr>
-      <w:r>
-        <w:rPr>
-          <w:rFonts w:ascii="Arial" w:cs="Arial" w:eastAsia="Arial" w:hAnsi="Arial"/>
-          <w:sz w:val="20"/>
-          <w:szCs w:val="20"/>
-        </w:rPr>
-        <w:t xml:space="preserve">LD50 (droga pokarmowa, szczur): &gt; 5000 mg/kg mc.</w:t>
-      </w:r>
-    </w:p>
-    <w:p>
-      <w:pPr>
-        <w:spacing w:after="80"/>
-      </w:pPr>
-      <w:r>
-        <w:rPr>
-          <w:rFonts w:ascii="Arial" w:cs="Arial" w:eastAsia="Arial" w:hAnsi="Arial"/>
-          <w:sz w:val="20"/>
-          <w:szCs w:val="20"/>
-        </w:rPr>
-        <w:t xml:space="preserve">LC50 (drogi oddechowe, pary, człowiek): 100 ppm</w:t>
-      </w:r>
-    </w:p>
-    <w:p>
-      <w:pPr>
-        <w:spacing w:after="80"/>
-      </w:pPr>
-      <w:r>
-        <w:rPr>
-          <w:rFonts w:ascii="Arial" w:cs="Arial" w:eastAsia="Arial" w:hAnsi="Arial"/>
-          <w:sz w:val="20"/>
-          <w:szCs w:val="20"/>
-        </w:rPr>
-        <w:t xml:space="preserve">Działanie żrące/drażniące na skórę:</w:t>
-      </w:r>
-    </w:p>
-    <w:p>
-      <w:pPr>
-        <w:spacing w:after="80"/>
-      </w:pPr>
-      <w:r>
-        <w:rPr>
-          <w:rFonts w:ascii="Arial" w:cs="Arial" w:eastAsia="Arial" w:hAnsi="Arial"/>
-          <w:sz w:val="20"/>
-          <w:szCs w:val="20"/>
-        </w:rPr>
-        <w:t xml:space="preserve">W oparciu o dostępne dane kryteria klasyfikacji nie są spełnione.</w:t>
-      </w:r>
-    </w:p>
-    <w:p>
-      <w:pPr>
-        <w:spacing w:after="80"/>
-      </w:pPr>
-      <w:r>
-        <w:rPr>
-          <w:rFonts w:ascii="Arial" w:cs="Arial" w:eastAsia="Arial" w:hAnsi="Arial"/>
-          <w:sz w:val="20"/>
-          <w:szCs w:val="20"/>
-        </w:rPr>
-        <w:t xml:space="preserve">Poważne uszkodzenie oczu/działanie drażniące na oczy:</w:t>
-      </w:r>
-    </w:p>
-    <w:p>
-      <w:pPr>
-        <w:spacing w:after="80"/>
-      </w:pPr>
-      <w:r>
-        <w:rPr>
-          <w:rFonts w:ascii="Arial" w:cs="Arial" w:eastAsia="Arial" w:hAnsi="Arial"/>
-          <w:sz w:val="20"/>
-          <w:szCs w:val="20"/>
-        </w:rPr>
-        <w:t xml:space="preserve">Działa drażniąco na oczy (zaklasyfikowano na podstawie stężenia etanolu ≥ 50%).</w:t>
-      </w:r>
-    </w:p>
-    <w:p>
-      <w:pPr>
-        <w:spacing w:after="80"/>
-      </w:pPr>
-      <w:r>
-        <w:rPr>
-          <w:rFonts w:ascii="Arial" w:cs="Arial" w:eastAsia="Arial" w:hAnsi="Arial"/>
-          <w:sz w:val="20"/>
-          <w:szCs w:val="20"/>
-        </w:rPr>
-        <w:t xml:space="preserve">Działanie uczulające na drogi oddechowe lub skórę:</w:t>
-      </w:r>
-    </w:p>
-    <w:p>
-      <w:pPr>
-        <w:spacing w:after="80"/>
-      </w:pPr>
-      <w:r>
-        <w:rPr>
-          <w:rFonts w:ascii="Arial" w:cs="Arial" w:eastAsia="Arial" w:hAnsi="Arial"/>
-          <w:sz w:val="20"/>
-          <w:szCs w:val="20"/>
-        </w:rPr>
-        <w:t xml:space="preserve">Może powodować wystąpienie reakcji alergicznej skóry.</w:t>
-      </w:r>
-    </w:p>
-    <w:p>
-      <w:pPr>
-        <w:spacing w:after="80"/>
-      </w:pPr>
-      <w:r>
-        <w:rPr>
-          <w:rFonts w:ascii="Arial" w:cs="Arial" w:eastAsia="Arial" w:hAnsi="Arial"/>
-          <w:sz w:val="20"/>
-          <w:szCs w:val="20"/>
-        </w:rPr>
-        <w:t xml:space="preserve">Zawiera: hydroksycytronellal, kumarynę, salicylan benzylu.</w:t>
-      </w:r>
-    </w:p>
-    <w:p>
-      <w:pPr>
-        <w:spacing w:after="80"/>
-      </w:pPr>
-      <w:r>
-        <w:rPr>
-          <w:rFonts w:ascii="Arial" w:cs="Arial" w:eastAsia="Arial" w:hAnsi="Arial"/>
-          <w:sz w:val="20"/>
-          <w:szCs w:val="20"/>
-        </w:rPr>
-        <w:t xml:space="preserve">Działanie mutagenne na komórki rozrodcze:</w:t>
-      </w:r>
-    </w:p>
-    <w:p>
-      <w:pPr>
-        <w:spacing w:after="80"/>
-      </w:pPr>
-      <w:r>
-        <w:rPr>
-          <w:rFonts w:ascii="Arial" w:cs="Arial" w:eastAsia="Arial" w:hAnsi="Arial"/>
-          <w:sz w:val="20"/>
-          <w:szCs w:val="20"/>
-        </w:rPr>
-        <w:t xml:space="preserve">W oparciu o dostępne dane kryteria klasyfikacji nie są spełnione.</w:t>
-      </w:r>
-    </w:p>
-    <w:p>
-      <w:pPr>
-        <w:spacing w:after="80"/>
-      </w:pPr>
-      <w:r>
-        <w:rPr>
-          <w:rFonts w:ascii="Arial" w:cs="Arial" w:eastAsia="Arial" w:hAnsi="Arial"/>
-          <w:sz w:val="20"/>
-          <w:szCs w:val="20"/>
-        </w:rPr>
-        <w:t xml:space="preserve">Rakotwórczość:</w:t>
-      </w:r>
-    </w:p>
-    <w:p>
-      <w:pPr>
-        <w:spacing w:after="80"/>
-      </w:pPr>
-      <w:r>
-        <w:rPr>
-          <w:rFonts w:ascii="Arial" w:cs="Arial" w:eastAsia="Arial" w:hAnsi="Arial"/>
-          <w:sz w:val="20"/>
-          <w:szCs w:val="20"/>
-        </w:rPr>
-        <w:t xml:space="preserve">W oparciu o dostępne dane kryteria klasyfikacji nie są spełnione.</w:t>
-      </w:r>
-    </w:p>
-    <w:p>
-      <w:pPr>
-        <w:spacing w:after="80"/>
-      </w:pPr>
-      <w:r>
-        <w:rPr>
-          <w:rFonts w:ascii="Arial" w:cs="Arial" w:eastAsia="Arial" w:hAnsi="Arial"/>
-          <w:sz w:val="20"/>
-          <w:szCs w:val="20"/>
-        </w:rPr>
-        <w:t xml:space="preserve">Toluen: Zaklasyfikowany do Grupy 3 (nie można zakwalifikować jako rakotwórczy dla ludzi) przez Międzynarodową Agencję Badań nad Rakiem (IARC, 1999). Agencja EPA (USA) stwierdza, że dane są niewystarczające do oceny potencjału rakotwórczego.</w:t>
-      </w:r>
-    </w:p>
-    <w:p>
-      <w:pPr>
-        <w:spacing w:after="80"/>
-      </w:pPr>
-      <w:r>
-        <w:rPr>
-          <w:rFonts w:ascii="Arial" w:cs="Arial" w:eastAsia="Arial" w:hAnsi="Arial"/>
-          <w:sz w:val="20"/>
-          <w:szCs w:val="20"/>
-        </w:rPr>
-        <w:t xml:space="preserve">Szkodliwe działanie na rozrodczość:</w:t>
-      </w:r>
-    </w:p>
-    <w:p>
-      <w:pPr>
-        <w:spacing w:after="80"/>
-      </w:pPr>
-      <w:r>
-        <w:rPr>
-          <w:rFonts w:ascii="Arial" w:cs="Arial" w:eastAsia="Arial" w:hAnsi="Arial"/>
-          <w:sz w:val="20"/>
-          <w:szCs w:val="20"/>
-        </w:rPr>
-        <w:t xml:space="preserve">W oparciu o dostępne dane kryteria klasyfikacji nie są spełnione.</w:t>
-      </w:r>
-    </w:p>
-    <w:p>
-      <w:pPr>
-        <w:spacing w:after="80"/>
-      </w:pPr>
-      <w:r>
-        <w:rPr>
-          <w:rFonts w:ascii="Arial" w:cs="Arial" w:eastAsia="Arial" w:hAnsi="Arial"/>
-          <w:sz w:val="20"/>
-          <w:szCs w:val="20"/>
-        </w:rPr>
-        <w:t xml:space="preserve">Działanie toksyczne na narządy docelowe – narażenie jednorazowe (STOT SE):</w:t>
-      </w:r>
-    </w:p>
-    <w:p>
-      <w:pPr>
-        <w:spacing w:after="80"/>
-      </w:pPr>
-      <w:r>
-        <w:rPr>
-          <w:rFonts w:ascii="Arial" w:cs="Arial" w:eastAsia="Arial" w:hAnsi="Arial"/>
-          <w:sz w:val="20"/>
-          <w:szCs w:val="20"/>
-        </w:rPr>
-        <w:t xml:space="preserve">W oparciu o dostępne dane kryteria klasyfikacji nie są spełnione.</w:t>
-      </w:r>
-    </w:p>
-    <w:p>
-      <w:pPr>
-        <w:spacing w:after="80"/>
-      </w:pPr>
-      <w:r>
-        <w:rPr>
-          <w:rFonts w:ascii="Arial" w:cs="Arial" w:eastAsia="Arial" w:hAnsi="Arial"/>
-          <w:sz w:val="20"/>
-          <w:szCs w:val="20"/>
-        </w:rPr>
-        <w:t xml:space="preserve">Działanie toksyczne na narządy docelowe – narażenie powtarzane (STOT RE):</w:t>
-      </w:r>
-    </w:p>
-    <w:p>
-      <w:pPr>
-        <w:spacing w:after="80"/>
-      </w:pPr>
-      <w:r>
-        <w:rPr>
-          <w:rFonts w:ascii="Arial" w:cs="Arial" w:eastAsia="Arial" w:hAnsi="Arial"/>
-          <w:sz w:val="20"/>
-          <w:szCs w:val="20"/>
-        </w:rPr>
-        <w:t xml:space="preserve">W oparciu o dostępne dane kryteria klasyfikacji nie są spełnione.</w:t>
-      </w:r>
-    </w:p>
-    <w:p>
-      <w:pPr>
-        <w:spacing w:after="80"/>
-      </w:pPr>
-      <w:r>
-        <w:rPr>
-          <w:rFonts w:ascii="Arial" w:cs="Arial" w:eastAsia="Arial" w:hAnsi="Arial"/>
-          <w:sz w:val="20"/>
-          <w:szCs w:val="20"/>
-        </w:rPr>
-        <w:t xml:space="preserve">Zagrożenie spowodowane aspiracją:</w:t>
-      </w:r>
-    </w:p>
-    <w:p>
-      <w:pPr>
-        <w:spacing w:after="80"/>
-      </w:pPr>
-      <w:r>
-        <w:rPr>
-          <w:rFonts w:ascii="Arial" w:cs="Arial" w:eastAsia="Arial" w:hAnsi="Arial"/>
-          <w:sz w:val="20"/>
-          <w:szCs w:val="20"/>
-        </w:rPr>
-        <w:t xml:space="preserve">W oparciu o dostępne dane kryteria klasyfikacji nie są spełnione.</w:t>
-      </w:r>
-    </w:p>
-    <w:p>
-      <w:pPr>
-        <w:spacing w:after="100" w:before="200"/>
-      </w:pPr>
-      <w:r>
-        <w:rPr>
-          <w:rFonts w:ascii="Arial" w:cs="Arial" w:eastAsia="Arial" w:hAnsi="Arial"/>
-          <w:b/>
-          <w:bCs/>
-          <w:sz w:val="20"/>
-          <w:szCs w:val="20"/>
-        </w:rPr>
-        <w:t xml:space="preserve">11.2. Informacje o innych zagrożeniach</w:t>
-      </w:r>
-    </w:p>
-    <w:p>
-      <w:pPr>
-        <w:spacing w:after="100" w:before="200"/>
-      </w:pPr>
-      <w:r>
-        <w:rPr>
-          <w:rFonts w:ascii="Arial" w:cs="Arial" w:eastAsia="Arial" w:hAnsi="Arial"/>
-          <w:b/>
-          <w:bCs/>
-          <w:sz w:val="20"/>
-          <w:szCs w:val="20"/>
-        </w:rPr>
-        <w:t xml:space="preserve">11.2.1. Właściwości zaburzające funkcjonowanie układu hormonalnego:</w:t>
-      </w:r>
-    </w:p>
-    <w:p>
-      <w:pPr>
-        <w:spacing w:after="80"/>
-      </w:pPr>
-      <w:r>
-        <w:rPr>
-          <w:rFonts w:ascii="Arial" w:cs="Arial" w:eastAsia="Arial" w:hAnsi="Arial"/>
-          <w:sz w:val="20"/>
-          <w:szCs w:val="20"/>
-        </w:rPr>
-        <w:t xml:space="preserve">W oparciu o dostępne dane produkt nie zawiera substancji wymienionych w głównych europejskich wykazach potencjalnych lub podejrzewanych substancji zaburzających funkcjonowanie układu hormonalnego w odniesieniu do zdrowia ludzkiego podlegających ocenie.</w:t>
-      </w:r>
-    </w:p>
-    <w:p>
-      <w:pPr>
-        <w:spacing w:after="100" w:before="200"/>
-      </w:pPr>
-      <w:r>
-        <w:rPr>
-          <w:rFonts w:ascii="Arial" w:cs="Arial" w:eastAsia="Arial" w:hAnsi="Arial"/>
-          <w:b/>
-          <w:bCs/>
-          <w:sz w:val="20"/>
-          <w:szCs w:val="20"/>
-        </w:rPr>
-        <w:t xml:space="preserve">11.2.2. Inne informacje:</w:t>
-      </w:r>
-    </w:p>
-    <w:p>
-      <w:pPr>
-        <w:spacing w:after="80"/>
-      </w:pPr>
-      <w:r>
-        <w:rPr>
-          <w:rFonts w:ascii="Arial" w:cs="Arial" w:eastAsia="Arial" w:hAnsi="Arial"/>
-          <w:sz w:val="20"/>
-          <w:szCs w:val="20"/>
-        </w:rPr>
-        <w:t xml:space="preserve">Brak dodatkowych informacji.</w:t>
+        <w:t xml:space="preserve">11.1. Toksyczność ostra: Metanol LD50 doustnie: 5628 mg/kg (szczur).</w:t>
       </w:r>
     </w:p>
     <w:p>
@@ -8251,20 +7555,20 @@
           <w:sz w:val="20"/>
           <w:szCs w:val="20"/>
         </w:rPr>
-        <w:t xml:space="preserve">Mieszanina jest zaklasyfikowana jako stwarzająca zagrożenie dla środowiska wodnego – kategoria przewlekła 3 (Aquatic Chronic 3, H412) na podstawie metody obliczeniowej sumowania stężeń składników.</w:t>
-      </w:r>
-    </w:p>
-    <w:p>
-      <w:pPr>
-        <w:spacing w:after="80"/>
-      </w:pPr>
-      <w:r>
-        <w:rPr>
-          <w:rFonts w:ascii="Arial" w:cs="Arial" w:eastAsia="Arial" w:hAnsi="Arial"/>
-          <w:sz w:val="20"/>
-          <w:szCs w:val="20"/>
-        </w:rPr>
-        <w:t xml:space="preserve">Brak danych doświadczalnych dla samej mieszaniny.</w:t>
+        <w:t xml:space="preserve">Mieszanina nie została zaklasyfikowana jako stwarzająca zagrożenie dla środowiska.</w:t>
+      </w:r>
+    </w:p>
+    <w:p>
+      <w:pPr>
+        <w:spacing w:after="80"/>
+      </w:pPr>
+      <w:r>
+        <w:rPr>
+          <w:rFonts w:ascii="Arial" w:cs="Arial" w:eastAsia="Arial" w:hAnsi="Arial"/>
+          <w:sz w:val="20"/>
+          <w:szCs w:val="20"/>
+        </w:rPr>
+        <w:t xml:space="preserve">Brak danych doświadczalnych dla mieszaniny.</w:t>
       </w:r>
     </w:p>
     <w:p>
@@ -9545,20 +8849,20 @@
           <w:sz w:val="20"/>
           <w:szCs w:val="20"/>
         </w:rPr>
-        <w:t xml:space="preserve">salicylan benzylu (CAS: 118-58-1): wykazuje potencjał do bioakumulacji, współczynnik biokoncentracji BCF = 311.</w:t>
-      </w:r>
-    </w:p>
-    <w:p>
-      <w:pPr>
-        <w:spacing w:after="80"/>
-      </w:pPr>
-      <w:r>
-        <w:rPr>
-          <w:rFonts w:ascii="Arial" w:cs="Arial" w:eastAsia="Arial" w:hAnsi="Arial"/>
-          <w:sz w:val="20"/>
-          <w:szCs w:val="20"/>
-        </w:rPr>
-        <w:t xml:space="preserve">galaksolid (1,3,4,6,7,8-heksahydro-4,6,6,7,8,8-heksametyloindeno[5,6-c]piran) (CAS: 1222-05-5): współczynnik podziału n-oktanol/woda (log Kow): 5,3, współczynnik biokoncentracji BCF = 498 (5 dni).</w:t>
+        <w:t xml:space="preserve">salicylan benzylu (CAS: 118-58-1): wykazuje zdolność do bioakumulacji (Bioaccumulative), współczynnik biokoncentracji BCF = 311..</w:t>
+      </w:r>
+    </w:p>
+    <w:p>
+      <w:pPr>
+        <w:spacing w:after="80"/>
+      </w:pPr>
+      <w:r>
+        <w:rPr>
+          <w:rFonts w:ascii="Arial" w:cs="Arial" w:eastAsia="Arial" w:hAnsi="Arial"/>
+          <w:sz w:val="20"/>
+          <w:szCs w:val="20"/>
+        </w:rPr>
+        <w:t xml:space="preserve">galaksolid (1,3,4,6,7,8-heksahydro-4,6,6,7,8,8-heksametyloindeno[5,6-c]piran) (CAS: 1222-05-5): współczynnik podziału n-oktanol/woda (log Kow): 5,3, współczynnik biokoncentracji BCF = 498  5 d.</w:t>
       </w:r>
     </w:p>
     <w:p>
@@ -9702,7 +9006,7 @@
           <w:sz w:val="20"/>
           <w:szCs w:val="20"/>
         </w:rPr>
-        <w:t xml:space="preserve">hydroksycytronellal (CAS: 107-75-5): współczynnik podziału gleba/woda (Koc): 1 przy 25 °C.</w:t>
+        <w:t xml:space="preserve">hydroksycytronellal (CAS: 107-75-5): współczynnik podziału gleba/woda (Koc): 1  a 25°C.</w:t>
       </w:r>
     </w:p>
     <w:p>

</xml_diff>